<commit_message>
Lettre de renvoi : modele regional - signataire 'Le Chef de la Commission Regionale des Marches'
Corrige LR_REGIONALE.docx : la ligne signataire passe de 'Nationale' a 'Regionale'
(uniquement cette ligne ; en-tete CNM et corps inchanges ; embleme conserve). Edition
ciblee via POI au niveau du paragraphe (texte fragmente sur plusieurs runs).

+1 test : document_genere_signataire_regional_ok (le PDF regional contient
'Le Chef de la Commission Regionale des Marches'). 245 verts.

Co-Authored-By: Claude Opus 4.8 (1M context) <noreply@anthropic.com>
</commit_message>
<xml_diff>
--- a/src/main/resources/templates/LR_REGIONALE.docx
+++ b/src/main/resources/templates/LR_REGIONALE.docx
@@ -521,98 +521,7 @@
         <w:rPr>
           <w:rFonts w:ascii="Times New Roman" w:hAnsi="Times New Roman"/>
         </w:rPr>
-        <w:t>Le</w:t>
-      </w:r>
-      <w:r>
-        <w:rPr>
-          <w:rFonts w:ascii="Times New Roman" w:hAnsi="Times New Roman"/>
-          <w:spacing w:val="-6"/>
-        </w:rPr>
-        <w:t xml:space="preserve"> </w:t>
-      </w:r>
-      <w:r>
-        <w:rPr>
-          <w:rFonts w:ascii="Times New Roman" w:hAnsi="Times New Roman"/>
-        </w:rPr>
-        <w:t>Chef</w:t>
-      </w:r>
-      <w:r>
-        <w:rPr>
-          <w:rFonts w:ascii="Times New Roman" w:hAnsi="Times New Roman"/>
-          <w:spacing w:val="-5"/>
-        </w:rPr>
-        <w:t xml:space="preserve"> </w:t>
-      </w:r>
-      <w:r>
-        <w:rPr>
-          <w:rFonts w:ascii="Times New Roman" w:hAnsi="Times New Roman"/>
-        </w:rPr>
-        <w:t>de</w:t>
-      </w:r>
-      <w:r>
-        <w:rPr>
-          <w:rFonts w:ascii="Times New Roman" w:hAnsi="Times New Roman"/>
-          <w:spacing w:val="-6"/>
-        </w:rPr>
-        <w:t xml:space="preserve"> </w:t>
-      </w:r>
-      <w:r>
-        <w:rPr>
-          <w:rFonts w:ascii="Times New Roman" w:hAnsi="Times New Roman"/>
-        </w:rPr>
-        <w:t>la</w:t>
-      </w:r>
-      <w:r>
-        <w:rPr>
-          <w:rFonts w:ascii="Times New Roman" w:hAnsi="Times New Roman"/>
-          <w:spacing w:val="-5"/>
-        </w:rPr>
-        <w:t xml:space="preserve"> </w:t>
-      </w:r>
-      <w:r>
-        <w:rPr>
-          <w:rFonts w:ascii="Times New Roman" w:hAnsi="Times New Roman"/>
-        </w:rPr>
-        <w:t>Commission</w:t>
-      </w:r>
-      <w:r>
-        <w:rPr>
-          <w:rFonts w:ascii="Times New Roman" w:hAnsi="Times New Roman"/>
-          <w:spacing w:val="-5"/>
-        </w:rPr>
-        <w:t xml:space="preserve"> </w:t>
-      </w:r>
-      <w:r>
-        <w:rPr>
-          <w:rFonts w:ascii="Times New Roman" w:hAnsi="Times New Roman"/>
-        </w:rPr>
-        <w:t>Nationale</w:t>
-      </w:r>
-      <w:r>
-        <w:rPr>
-          <w:rFonts w:ascii="Times New Roman" w:hAnsi="Times New Roman"/>
-          <w:spacing w:val="-5"/>
-        </w:rPr>
-        <w:t xml:space="preserve"> </w:t>
-      </w:r>
-      <w:r>
-        <w:rPr>
-          <w:rFonts w:ascii="Times New Roman" w:hAnsi="Times New Roman"/>
-        </w:rPr>
-        <w:t>des</w:t>
-      </w:r>
-      <w:r>
-        <w:rPr>
-          <w:rFonts w:ascii="Times New Roman" w:hAnsi="Times New Roman"/>
-          <w:spacing w:val="-5"/>
-        </w:rPr>
-        <w:t xml:space="preserve"> </w:t>
-      </w:r>
-      <w:r>
-        <w:rPr>
-          <w:rFonts w:ascii="Times New Roman" w:hAnsi="Times New Roman"/>
-        </w:rPr>
-        <w:t>Marchés</w:t>
+        <w:t>Le Chef de la Commission Régionale des Marchés</w:t>
       </w:r>
     </w:p>
     <w:p>

</xml_diff>